<commit_message>
File 06 matches the template: seven sections; American spelling in the docx
- File 06 lists §7 Close the Case, as the Word template has it; the CLUE table
  says the Case File fills in §3–7.
- The template spells behavioral and optimization like the page (four words,
  nothing else in the file changed).

Co-Authored-By: Claude Opus 5.5 <noreply@anthropic.com>
</commit_message>
<xml_diff>
--- a/files/case-file-template.docx
+++ b/files/case-file-template.docx
@@ -2084,7 +2084,7 @@
                 <w:sz w:val="16"/>
                 <w:szCs w:val="16"/>
               </w:rPr>
-              <w:t xml:space="preserve">BEHAVIOURAL LEADING INDICATORS</w:t>
+              <w:t xml:space="preserve">BEHAVIORAL LEADING INDICATORS</w:t>
             </w:r>
           </w:p>
           <w:p>
@@ -3079,7 +3079,7 @@
                 <w:sz w:val="18"/>
                 <w:szCs w:val="18"/>
               </w:rPr>
-              <w:t xml:space="preserve">Limited rollout, behavioural measurement. → Impact report.</w:t>
+              <w:t xml:space="preserve">Limited rollout, behavioral measurement. → Impact report.</w:t>
             </w:r>
           </w:p>
         </w:tc>
@@ -3301,7 +3301,7 @@
                 <w:sz w:val="16"/>
                 <w:szCs w:val="16"/>
               </w:rPr>
-              <w:t xml:space="preserve">PHASE 5 · OPTIMISATION</w:t>
+              <w:t xml:space="preserve">PHASE 5 · OPTIMIZATION</w:t>
             </w:r>
           </w:p>
           <w:p>
@@ -5433,7 +5433,7 @@
                 <w:sz w:val="18"/>
                 <w:szCs w:val="18"/>
               </w:rPr>
-              <w:t xml:space="preserve">KPI movement and behavioural adoption. Never seat time alone.</w:t>
+              <w:t xml:space="preserve">KPI movement and behavioral adoption. Never seat time alone.</w:t>
             </w:r>
           </w:p>
         </w:tc>

</xml_diff>

<commit_message>
Case File: say it is a kit, not a form; four logic fixes Hanna approved
File 06 has a note above the download button: every case needs The Case,
§1 and §7; §2-3 when you build something; §4-6 for big cases; the intake
notes fill most of §1. The Word template carries the same note after its
intro and a tag under each section's CLUE letters (EVERY CASE / WHEN YOU
BUILD / BIG CASES).

Also: File 07 in the one-picture strip is "Hand over the rest", File 07's
"When to use this" names the build-or-hand-over decision, the §5 row lists
sunset decisions as the template does, and the intake's last line says the
notes fill most of §1.

Co-Authored-By: Claude Opus 5.5 <noreply@anthropic.com>
</commit_message>
<xml_diff>
--- a/files/case-file-template.docx
+++ b/files/case-file-template.docx
@@ -102,6 +102,177 @@
         </w:rPr>
         <w:t xml:space="preserve">Fill in what you know. The blanks tell you what to investigate next, and the notes on the left stay put so you can hand this to someone else half-finished.</w:t>
       </w:r>
+    </w:p>
+    <w:tbl>
+      <w:tblPr>
+        <w:tblW w:type="dxa" w:w="9746"/>
+        <w:tblBorders>
+          <w:top w:val="none" w:color="FFFFFF" w:sz="0"/>
+          <w:left w:val="none" w:color="FFFFFF" w:sz="0"/>
+          <w:bottom w:val="none" w:color="FFFFFF" w:sz="0"/>
+          <w:right w:val="none" w:color="FFFFFF" w:sz="0"/>
+          <w:insideH w:val="none" w:color="FFFFFF" w:sz="0"/>
+          <w:insideV w:val="none" w:color="FFFFFF" w:sz="0"/>
+        </w:tblBorders>
+      </w:tblPr>
+      <w:tblGrid>
+        <w:gridCol w:w="9746"/>
+      </w:tblGrid>
+      <w:tr>
+        <w:tc>
+          <w:tcPr>
+            <w:tcW w:type="dxa" w:w="9746"/>
+            <w:tcBorders>
+              <w:top w:val="none" w:color="FFFFFF" w:sz="0"/>
+              <w:left w:val="single" w:color="C9A227" w:sz="18"/>
+              <w:bottom w:val="none" w:color="FFFFFF" w:sz="0"/>
+              <w:right w:val="none" w:color="FFFFFF" w:sz="0"/>
+            </w:tcBorders>
+            <w:shd w:fill="FAF3E1" w:color="auto" w:val="clear"/>
+            <w:tcMar>
+              <w:top w:type="dxa" w:w="180"/>
+              <w:left w:type="dxa" w:w="240"/>
+              <w:bottom w:type="dxa" w:w="180"/>
+              <w:right w:type="dxa" w:w="240"/>
+            </w:tcMar>
+          </w:tcPr>
+          <w:p>
+            <w:pPr>
+              <w:spacing w:after="80" w:before="0"/>
+            </w:pPr>
+            <w:r>
+              <w:rPr>
+                <w:rFonts w:ascii="Consolas" w:cs="Consolas" w:eastAsia="Consolas" w:hAnsi="Consolas"/>
+                <w:b/>
+                <w:bCs/>
+                <w:color w:val="7A5A08"/>
+                <w:spacing w:val="18"/>
+                <w:sz w:val="16"/>
+                <w:szCs w:val="16"/>
+              </w:rPr>
+              <w:t xml:space="preserve">YOU WON'T NEED ALL OF IT</w:t>
+            </w:r>
+          </w:p>
+          <w:p>
+            <w:pPr>
+              <w:spacing w:after="100" w:before="0"/>
+            </w:pPr>
+            <w:r>
+              <w:rPr>
+                <w:rFonts w:ascii="Calibri" w:cs="Calibri" w:eastAsia="Calibri" w:hAnsi="Calibri"/>
+                <w:b w:val="false"/>
+                <w:bCs w:val="false"/>
+                <w:color w:val="1C2530"/>
+                <w:sz w:val="20"/>
+                <w:szCs w:val="20"/>
+              </w:rPr>
+              <w:t xml:space="preserve">Not every case faces a steering committee. This is the full kit: keep the sections your case needs and delete the rest. Each section says on the right when you need it.</w:t>
+            </w:r>
+          </w:p>
+          <w:p>
+            <w:pPr>
+              <w:spacing w:after="40" w:before="0"/>
+            </w:pPr>
+            <w:r>
+              <w:rPr>
+                <w:rFonts w:ascii="Calibri" w:cs="Calibri" w:eastAsia="Calibri" w:hAnsi="Calibri"/>
+                <w:b/>
+                <w:bCs/>
+                <w:color w:val="1C2530"/>
+                <w:sz w:val="20"/>
+                <w:szCs w:val="20"/>
+              </w:rPr>
+              <w:t xml:space="preserve">Every case: </w:t>
+            </w:r>
+            <w:r>
+              <w:rPr>
+                <w:rFonts w:ascii="Calibri" w:cs="Calibri" w:eastAsia="Calibri" w:hAnsi="Calibri"/>
+                <w:b w:val="false"/>
+                <w:bCs w:val="false"/>
+                <w:color w:val="1C2530"/>
+                <w:sz w:val="20"/>
+                <w:szCs w:val="20"/>
+              </w:rPr>
+              <w:t xml:space="preserve">The Case, §1 The Motive, §7 Close the Case.</w:t>
+            </w:r>
+          </w:p>
+          <w:p>
+            <w:pPr>
+              <w:spacing w:after="40" w:before="0"/>
+            </w:pPr>
+            <w:r>
+              <w:rPr>
+                <w:rFonts w:ascii="Calibri" w:cs="Calibri" w:eastAsia="Calibri" w:hAnsi="Calibri"/>
+                <w:b/>
+                <w:bCs/>
+                <w:color w:val="1C2530"/>
+                <w:sz w:val="20"/>
+                <w:szCs w:val="20"/>
+              </w:rPr>
+              <w:t xml:space="preserve">When you build something: </w:t>
+            </w:r>
+            <w:r>
+              <w:rPr>
+                <w:rFonts w:ascii="Calibri" w:cs="Calibri" w:eastAsia="Calibri" w:hAnsi="Calibri"/>
+                <w:b w:val="false"/>
+                <w:bCs w:val="false"/>
+                <w:color w:val="1C2530"/>
+                <w:sz w:val="20"/>
+                <w:szCs w:val="20"/>
+              </w:rPr>
+              <w:t xml:space="preserve">add §2 The Targets and §3 The Blueprint.</w:t>
+            </w:r>
+          </w:p>
+          <w:p>
+            <w:pPr>
+              <w:spacing w:after="40" w:before="0"/>
+            </w:pPr>
+            <w:r>
+              <w:rPr>
+                <w:rFonts w:ascii="Calibri" w:cs="Calibri" w:eastAsia="Calibri" w:hAnsi="Calibri"/>
+                <w:b/>
+                <w:bCs/>
+                <w:color w:val="1C2530"/>
+                <w:sz w:val="20"/>
+                <w:szCs w:val="20"/>
+              </w:rPr>
+              <w:t xml:space="preserve">Big cases, with real budget, a pilot gate or several teams: </w:t>
+            </w:r>
+            <w:r>
+              <w:rPr>
+                <w:rFonts w:ascii="Calibri" w:cs="Calibri" w:eastAsia="Calibri" w:hAnsi="Calibri"/>
+                <w:b w:val="false"/>
+                <w:bCs w:val="false"/>
+                <w:color w:val="1C2530"/>
+                <w:sz w:val="20"/>
+                <w:szCs w:val="20"/>
+              </w:rPr>
+              <w:t xml:space="preserve">add §4, §5 and §6.</w:t>
+            </w:r>
+          </w:p>
+          <w:p>
+            <w:pPr>
+              <w:spacing w:after="0" w:before="80"/>
+            </w:pPr>
+            <w:r>
+              <w:rPr>
+                <w:rFonts w:ascii="Calibri" w:cs="Calibri" w:eastAsia="Calibri" w:hAnsi="Calibri"/>
+                <w:b w:val="false"/>
+                <w:bCs w:val="false"/>
+                <w:color w:val="5B6673"/>
+                <w:sz w:val="19"/>
+                <w:szCs w:val="19"/>
+              </w:rPr>
+              <w:t xml:space="preserve">Ran the intake on the site? Your notes fill most of §1.</w:t>
+            </w:r>
+          </w:p>
+        </w:tc>
+      </w:tr>
+    </w:tbl>
+    <w:p>
+      <w:pPr>
+        <w:spacing w:after="0" w:before="0"/>
+      </w:pPr>
     </w:p>
     <w:p>
       <w:pPr>
@@ -871,6 +1042,24 @@
               <w:t xml:space="preserve">CLUE  C</w:t>
             </w:r>
           </w:p>
+          <w:p>
+            <w:pPr>
+              <w:spacing w:after="0" w:before="40"/>
+              <w:jc w:val="right"/>
+            </w:pPr>
+            <w:r>
+              <w:rPr>
+                <w:rFonts w:ascii="Consolas" w:cs="Consolas" w:eastAsia="Consolas" w:hAnsi="Consolas"/>
+                <w:b/>
+                <w:bCs/>
+                <w:color w:val="5B6673"/>
+                <w:spacing w:val="18"/>
+                <w:sz w:val="14"/>
+                <w:szCs w:val="14"/>
+              </w:rPr>
+              <w:t xml:space="preserve">EVERY CASE</w:t>
+            </w:r>
+          </w:p>
         </w:tc>
       </w:tr>
     </w:tbl>
@@ -1555,6 +1744,24 @@
                 <w:szCs w:val="17"/>
               </w:rPr>
               <w:t xml:space="preserve">CLUE  C, L</w:t>
+            </w:r>
+          </w:p>
+          <w:p>
+            <w:pPr>
+              <w:spacing w:after="0" w:before="40"/>
+              <w:jc w:val="right"/>
+            </w:pPr>
+            <w:r>
+              <w:rPr>
+                <w:rFonts w:ascii="Consolas" w:cs="Consolas" w:eastAsia="Consolas" w:hAnsi="Consolas"/>
+                <w:b/>
+                <w:bCs/>
+                <w:color w:val="5B6673"/>
+                <w:spacing w:val="18"/>
+                <w:sz w:val="14"/>
+                <w:szCs w:val="14"/>
+              </w:rPr>
+              <w:t xml:space="preserve">WHEN YOU BUILD</w:t>
             </w:r>
           </w:p>
         </w:tc>
@@ -2328,6 +2535,24 @@
               <w:t xml:space="preserve">CLUE  E</w:t>
             </w:r>
           </w:p>
+          <w:p>
+            <w:pPr>
+              <w:spacing w:after="0" w:before="40"/>
+              <w:jc w:val="right"/>
+            </w:pPr>
+            <w:r>
+              <w:rPr>
+                <w:rFonts w:ascii="Consolas" w:cs="Consolas" w:eastAsia="Consolas" w:hAnsi="Consolas"/>
+                <w:b/>
+                <w:bCs/>
+                <w:color w:val="5B6673"/>
+                <w:spacing w:val="18"/>
+                <w:sz w:val="14"/>
+                <w:szCs w:val="14"/>
+              </w:rPr>
+              <w:t xml:space="preserve">WHEN YOU BUILD</w:t>
+            </w:r>
+          </w:p>
         </w:tc>
       </w:tr>
     </w:tbl>
@@ -2852,6 +3077,24 @@
                 <w:szCs w:val="17"/>
               </w:rPr>
               <w:t xml:space="preserve">CLUE  U, E</w:t>
+            </w:r>
+          </w:p>
+          <w:p>
+            <w:pPr>
+              <w:spacing w:after="0" w:before="40"/>
+              <w:jc w:val="right"/>
+            </w:pPr>
+            <w:r>
+              <w:rPr>
+                <w:rFonts w:ascii="Consolas" w:cs="Consolas" w:eastAsia="Consolas" w:hAnsi="Consolas"/>
+                <w:b/>
+                <w:bCs/>
+                <w:color w:val="5B6673"/>
+                <w:spacing w:val="18"/>
+                <w:sz w:val="14"/>
+                <w:szCs w:val="14"/>
+              </w:rPr>
+              <w:t xml:space="preserve">BIG CASES</w:t>
             </w:r>
           </w:p>
         </w:tc>
@@ -3463,6 +3706,24 @@
                 <w:szCs w:val="17"/>
               </w:rPr>
               <w:t xml:space="preserve">CLUE  E</w:t>
+            </w:r>
+          </w:p>
+          <w:p>
+            <w:pPr>
+              <w:spacing w:after="0" w:before="40"/>
+              <w:jc w:val="right"/>
+            </w:pPr>
+            <w:r>
+              <w:rPr>
+                <w:rFonts w:ascii="Consolas" w:cs="Consolas" w:eastAsia="Consolas" w:hAnsi="Consolas"/>
+                <w:b/>
+                <w:bCs/>
+                <w:color w:val="5B6673"/>
+                <w:spacing w:val="18"/>
+                <w:sz w:val="14"/>
+                <w:szCs w:val="14"/>
+              </w:rPr>
+              <w:t xml:space="preserve">BIG CASES</w:t>
             </w:r>
           </w:p>
         </w:tc>
@@ -5126,6 +5387,24 @@
                 <w:szCs w:val="17"/>
               </w:rPr>
               <w:t xml:space="preserve">CLUE  E</w:t>
+            </w:r>
+          </w:p>
+          <w:p>
+            <w:pPr>
+              <w:spacing w:after="0" w:before="40"/>
+              <w:jc w:val="right"/>
+            </w:pPr>
+            <w:r>
+              <w:rPr>
+                <w:rFonts w:ascii="Consolas" w:cs="Consolas" w:eastAsia="Consolas" w:hAnsi="Consolas"/>
+                <w:b/>
+                <w:bCs/>
+                <w:color w:val="5B6673"/>
+                <w:spacing w:val="18"/>
+                <w:sz w:val="14"/>
+                <w:szCs w:val="14"/>
+              </w:rPr>
+              <w:t xml:space="preserve">BIG CASES</w:t>
             </w:r>
           </w:p>
         </w:tc>
@@ -6383,6 +6662,24 @@
                 <w:szCs w:val="17"/>
               </w:rPr>
               <w:t xml:space="preserve">CLUE  E</w:t>
+            </w:r>
+          </w:p>
+          <w:p>
+            <w:pPr>
+              <w:spacing w:after="0" w:before="40"/>
+              <w:jc w:val="right"/>
+            </w:pPr>
+            <w:r>
+              <w:rPr>
+                <w:rFonts w:ascii="Consolas" w:cs="Consolas" w:eastAsia="Consolas" w:hAnsi="Consolas"/>
+                <w:b/>
+                <w:bCs/>
+                <w:color w:val="5B6673"/>
+                <w:spacing w:val="18"/>
+                <w:sz w:val="14"/>
+                <w:szCs w:val="14"/>
+              </w:rPr>
+              <w:t xml:space="preserve">EVERY CASE</w:t>
             </w:r>
           </w:p>
         </w:tc>

</xml_diff>